<commit_message>
add nips 2016 record
</commit_message>
<xml_diff>
--- a/cv/Ming CV_public.docx
+++ b/cv/Ming CV_public.docx
@@ -359,21 +359,7 @@
               <w:rPr>
                 <w:rFonts w:ascii="Times New Roman" w:hAnsi="Times New Roman"/>
               </w:rPr>
-              <w:t xml:space="preserve">Advisor: </w:t>
-            </w:r>
-            <w:proofErr w:type="spellStart"/>
-            <w:r>
-              <w:rPr>
-                <w:rFonts w:ascii="Times New Roman" w:hAnsi="Times New Roman"/>
-              </w:rPr>
-              <w:t>Rong</w:t>
-            </w:r>
-            <w:proofErr w:type="spellEnd"/>
-            <w:r>
-              <w:rPr>
-                <w:rFonts w:ascii="Times New Roman" w:hAnsi="Times New Roman"/>
-              </w:rPr>
-              <w:t xml:space="preserve"> Jin</w:t>
+              <w:t>Advisor: Rong Jin</w:t>
             </w:r>
             <w:r>
               <w:rPr>
@@ -454,21 +440,7 @@
               <w:rPr>
                 <w:rFonts w:ascii="Times New Roman" w:hAnsi="Times New Roman"/>
               </w:rPr>
-              <w:t xml:space="preserve">Carnegie Mellon University, </w:t>
-            </w:r>
-            <w:proofErr w:type="gramStart"/>
-            <w:r>
-              <w:rPr>
-                <w:rFonts w:ascii="Times New Roman" w:hAnsi="Times New Roman"/>
-              </w:rPr>
-              <w:t>Pittsburgh</w:t>
-            </w:r>
-            <w:proofErr w:type="gramEnd"/>
-            <w:r>
-              <w:rPr>
-                <w:rFonts w:ascii="Times New Roman" w:hAnsi="Times New Roman"/>
-              </w:rPr>
-              <w:t>, PA 15213, United States</w:t>
+              <w:t>Carnegie Mellon University, Pittsburgh, PA 15213, United States</w:t>
             </w:r>
             <w:r>
               <w:rPr>
@@ -717,21 +689,7 @@
               <w:rPr>
                 <w:rFonts w:ascii="Times New Roman" w:hAnsi="Times New Roman" w:hint="eastAsia"/>
               </w:rPr>
-              <w:t xml:space="preserve">Advisor: </w:t>
-            </w:r>
-            <w:proofErr w:type="spellStart"/>
-            <w:r>
-              <w:rPr>
-                <w:rFonts w:ascii="Times New Roman" w:hAnsi="Times New Roman" w:hint="eastAsia"/>
-              </w:rPr>
-              <w:t>Jieping</w:t>
-            </w:r>
-            <w:proofErr w:type="spellEnd"/>
-            <w:r>
-              <w:rPr>
-                <w:rFonts w:ascii="Times New Roman" w:hAnsi="Times New Roman" w:hint="eastAsia"/>
-              </w:rPr>
-              <w:t xml:space="preserve"> Ye.</w:t>
+              <w:t>Advisor: Jieping Ye.</w:t>
             </w:r>
           </w:p>
         </w:tc>
@@ -1019,7 +977,7 @@
           <w:numId w:val="2"/>
         </w:numPr>
         <w:rPr>
-          <w:rFonts w:ascii="Times New Roman" w:hAnsi="Times New Roman" w:hint="eastAsia"/>
+          <w:rFonts w:ascii="Times New Roman" w:hAnsi="Times New Roman"/>
         </w:rPr>
       </w:pPr>
       <w:r>
@@ -1037,7 +995,7 @@
           <w:numId w:val="2"/>
         </w:numPr>
         <w:rPr>
-          <w:rFonts w:ascii="Times New Roman" w:hAnsi="Times New Roman" w:hint="eastAsia"/>
+          <w:rFonts w:ascii="Times New Roman" w:hAnsi="Times New Roman"/>
         </w:rPr>
       </w:pPr>
       <w:r>
@@ -1073,23 +1031,15 @@
           <w:numId w:val="2"/>
         </w:numPr>
         <w:rPr>
-          <w:rFonts w:ascii="Times New Roman" w:hAnsi="Times New Roman" w:hint="eastAsia"/>
-        </w:rPr>
-      </w:pPr>
-      <w:proofErr w:type="spellStart"/>
+          <w:rFonts w:ascii="Times New Roman" w:hAnsi="Times New Roman"/>
+        </w:rPr>
+      </w:pPr>
       <w:r>
         <w:rPr>
           <w:rFonts w:ascii="Times New Roman" w:hAnsi="Times New Roman"/>
         </w:rPr>
         <w:lastRenderedPageBreak/>
-        <w:t>Neurocomputering</w:t>
-      </w:r>
-      <w:proofErr w:type="spellEnd"/>
-      <w:r>
-        <w:rPr>
-          <w:rFonts w:ascii="Times New Roman" w:hAnsi="Times New Roman"/>
-        </w:rPr>
-        <w:t>.</w:t>
+        <w:t>Neurocomputering.</w:t>
       </w:r>
     </w:p>
     <w:p>
@@ -1191,19 +1141,11 @@
           <w:rFonts w:ascii="Times New Roman" w:hAnsi="Times New Roman"/>
         </w:rPr>
       </w:pPr>
-      <w:proofErr w:type="spellStart"/>
-      <w:r>
-        <w:rPr>
-          <w:rFonts w:ascii="Times New Roman" w:hAnsi="Times New Roman"/>
-        </w:rPr>
-        <w:t>Lijun</w:t>
-      </w:r>
-      <w:proofErr w:type="spellEnd"/>
-      <w:r>
-        <w:rPr>
-          <w:rFonts w:ascii="Times New Roman" w:hAnsi="Times New Roman"/>
-        </w:rPr>
-        <w:t xml:space="preserve"> Zhang,</w:t>
+      <w:r>
+        <w:rPr>
+          <w:rFonts w:ascii="Times New Roman" w:hAnsi="Times New Roman"/>
+        </w:rPr>
+        <w:t>Lijun Zhang,</w:t>
       </w:r>
       <w:r>
         <w:rPr>
@@ -1211,19 +1153,11 @@
         </w:rPr>
         <w:t xml:space="preserve"> </w:t>
       </w:r>
-      <w:proofErr w:type="spellStart"/>
-      <w:r>
-        <w:rPr>
-          <w:rFonts w:ascii="Times New Roman" w:hAnsi="Times New Roman"/>
-        </w:rPr>
-        <w:t>Jinfeng</w:t>
-      </w:r>
-      <w:proofErr w:type="spellEnd"/>
-      <w:r>
-        <w:rPr>
-          <w:rFonts w:ascii="Times New Roman" w:hAnsi="Times New Roman"/>
-        </w:rPr>
-        <w:t xml:space="preserve"> Yi,</w:t>
+      <w:r>
+        <w:rPr>
+          <w:rFonts w:ascii="Times New Roman" w:hAnsi="Times New Roman"/>
+        </w:rPr>
+        <w:t>Jinfeng Yi,</w:t>
       </w:r>
       <w:r>
         <w:rPr>
@@ -1235,21 +1169,7 @@
         <w:rPr>
           <w:rFonts w:ascii="Times New Roman" w:hAnsi="Times New Roman"/>
         </w:rPr>
-        <w:t xml:space="preserve">Ming Lin, </w:t>
-      </w:r>
-      <w:proofErr w:type="spellStart"/>
-      <w:r>
-        <w:rPr>
-          <w:rFonts w:ascii="Times New Roman" w:hAnsi="Times New Roman"/>
-        </w:rPr>
-        <w:t>Xiaofei</w:t>
-      </w:r>
-      <w:proofErr w:type="spellEnd"/>
-      <w:r>
-        <w:rPr>
-          <w:rFonts w:ascii="Times New Roman" w:hAnsi="Times New Roman"/>
-        </w:rPr>
-        <w:t xml:space="preserve"> He. Online Kernel Learning with a Near Optimal Sparsity Bound. International Conference on Machine Learning (ICML), 2013.</w:t>
+        <w:t>Ming Lin, Xiaofei He. Online Kernel Learning with a Near Optimal Sparsity Bound. International Conference on Machine Learning (ICML), 2013.</w:t>
       </w:r>
     </w:p>
     <w:p>
@@ -1267,63 +1187,7 @@
         <w:rPr>
           <w:rFonts w:ascii="Times New Roman" w:hAnsi="Times New Roman"/>
         </w:rPr>
-        <w:t xml:space="preserve">Ming Lin, </w:t>
-      </w:r>
-      <w:proofErr w:type="spellStart"/>
-      <w:r>
-        <w:rPr>
-          <w:rFonts w:ascii="Times New Roman" w:hAnsi="Times New Roman"/>
-        </w:rPr>
-        <w:t>Rong</w:t>
-      </w:r>
-      <w:proofErr w:type="spellEnd"/>
-      <w:r>
-        <w:rPr>
-          <w:rFonts w:ascii="Times New Roman" w:hAnsi="Times New Roman"/>
-        </w:rPr>
-        <w:t xml:space="preserve"> Jin, </w:t>
-      </w:r>
-      <w:proofErr w:type="spellStart"/>
-      <w:r>
-        <w:rPr>
-          <w:rFonts w:ascii="Times New Roman" w:hAnsi="Times New Roman"/>
-        </w:rPr>
-        <w:t>Changshui</w:t>
-      </w:r>
-      <w:proofErr w:type="spellEnd"/>
-      <w:r>
-        <w:rPr>
-          <w:rFonts w:ascii="Times New Roman" w:hAnsi="Times New Roman"/>
-        </w:rPr>
-        <w:t xml:space="preserve"> Zhang. Efficient Sparse Recovery via Adaptive Non-Convex </w:t>
-      </w:r>
-      <w:proofErr w:type="spellStart"/>
-      <w:r>
-        <w:rPr>
-          <w:rFonts w:ascii="Times New Roman" w:hAnsi="Times New Roman"/>
-        </w:rPr>
-        <w:t>Regularizers</w:t>
-      </w:r>
-      <w:proofErr w:type="spellEnd"/>
-      <w:r>
-        <w:rPr>
-          <w:rFonts w:ascii="Times New Roman" w:hAnsi="Times New Roman"/>
-        </w:rPr>
-        <w:t xml:space="preserve"> with Oracle Property. Uncertainty in Artificial </w:t>
-      </w:r>
-      <w:proofErr w:type="spellStart"/>
-      <w:r>
-        <w:rPr>
-          <w:rFonts w:ascii="Times New Roman" w:hAnsi="Times New Roman"/>
-        </w:rPr>
-        <w:t>Intelligenre</w:t>
-      </w:r>
-      <w:proofErr w:type="spellEnd"/>
-      <w:r>
-        <w:rPr>
-          <w:rFonts w:ascii="Times New Roman" w:hAnsi="Times New Roman"/>
-        </w:rPr>
-        <w:t xml:space="preserve"> (UAI), 2014.</w:t>
+        <w:t>Ming Lin, Rong Jin, Changshui Zhang. Efficient Sparse Recovery via Adaptive Non-Convex Regularizers with Oracle Property. Uncertainty in Artificial Intelligenre (UAI), 2014.</w:t>
       </w:r>
     </w:p>
     <w:p>
@@ -1341,21 +1205,7 @@
         <w:rPr>
           <w:rFonts w:ascii="Times New Roman" w:hAnsi="Times New Roman"/>
         </w:rPr>
-        <w:t xml:space="preserve">Ming Lin, </w:t>
-      </w:r>
-      <w:proofErr w:type="spellStart"/>
-      <w:r>
-        <w:rPr>
-          <w:rFonts w:ascii="Times New Roman" w:hAnsi="Times New Roman"/>
-        </w:rPr>
-        <w:t>Zhenzhong</w:t>
-      </w:r>
-      <w:proofErr w:type="spellEnd"/>
-      <w:r>
-        <w:rPr>
-          <w:rFonts w:ascii="Times New Roman" w:hAnsi="Times New Roman"/>
-        </w:rPr>
-        <w:t xml:space="preserve"> Lang, Alexander G. Hauptmann. Density Corrected Sparse Recovery when R.I.P. Condition is Broken. International Joint Conference on Artificial Intelligence (IJCAI), 2015.</w:t>
+        <w:t>Ming Lin, Zhenzhong Lang, Alexander G. Hauptmann. Density Corrected Sparse Recovery when R.I.P. Condition is Broken. International Joint Conference on Artificial Intelligence (IJCAI), 2015.</w:t>
       </w:r>
     </w:p>
     <w:p>
@@ -1369,63 +1219,11 @@
           <w:rFonts w:ascii="Times New Roman" w:hAnsi="Times New Roman"/>
         </w:rPr>
       </w:pPr>
-      <w:proofErr w:type="spellStart"/>
-      <w:r>
-        <w:rPr>
-          <w:rFonts w:ascii="Times New Roman" w:hAnsi="Times New Roman"/>
-        </w:rPr>
-        <w:t>Zhenzhong</w:t>
-      </w:r>
-      <w:proofErr w:type="spellEnd"/>
-      <w:r>
-        <w:rPr>
-          <w:rFonts w:ascii="Times New Roman" w:hAnsi="Times New Roman"/>
-        </w:rPr>
-        <w:t xml:space="preserve"> </w:t>
-      </w:r>
-      <w:proofErr w:type="spellStart"/>
-      <w:proofErr w:type="gramStart"/>
-      <w:r>
-        <w:rPr>
-          <w:rFonts w:ascii="Times New Roman" w:hAnsi="Times New Roman"/>
-        </w:rPr>
-        <w:t>Lan</w:t>
-      </w:r>
-      <w:proofErr w:type="spellEnd"/>
-      <w:proofErr w:type="gramEnd"/>
-      <w:r>
-        <w:rPr>
-          <w:rFonts w:ascii="Times New Roman" w:hAnsi="Times New Roman"/>
-        </w:rPr>
-        <w:t xml:space="preserve">, Ming Lin, </w:t>
-      </w:r>
-      <w:proofErr w:type="spellStart"/>
-      <w:r>
-        <w:rPr>
-          <w:rFonts w:ascii="Times New Roman" w:hAnsi="Times New Roman"/>
-        </w:rPr>
-        <w:t>Xuanchong</w:t>
-      </w:r>
-      <w:proofErr w:type="spellEnd"/>
-      <w:r>
-        <w:rPr>
-          <w:rFonts w:ascii="Times New Roman" w:hAnsi="Times New Roman"/>
-        </w:rPr>
-        <w:t xml:space="preserve"> Li, Alexander G. Hauptmann, </w:t>
-      </w:r>
-      <w:proofErr w:type="spellStart"/>
-      <w:r>
-        <w:rPr>
-          <w:rFonts w:ascii="Times New Roman" w:hAnsi="Times New Roman"/>
-        </w:rPr>
-        <w:t>Bhiksha</w:t>
-      </w:r>
-      <w:proofErr w:type="spellEnd"/>
-      <w:r>
-        <w:rPr>
-          <w:rFonts w:ascii="Times New Roman" w:hAnsi="Times New Roman"/>
-        </w:rPr>
-        <w:t xml:space="preserve"> Raj. Beyond Gaussian Pyramid: Multi-skip Feature Stacking for Action Recognition. IEEE Conference on Computer Vision and Pattern Recognition (CVPR), 2015.</w:t>
+      <w:r>
+        <w:rPr>
+          <w:rFonts w:ascii="Times New Roman" w:hAnsi="Times New Roman"/>
+        </w:rPr>
+        <w:t>Zhenzhong Lan, Ming Lin, Xuanchong Li, Alexander G. Hauptmann, Bhiksha Raj. Beyond Gaussian Pyramid: Multi-skip Feature Stacking for Action Recognition. IEEE Conference on Computer Vision and Pattern Recognition (CVPR), 2015.</w:t>
       </w:r>
     </w:p>
     <w:p>
@@ -1443,49 +1241,7 @@
         <w:rPr>
           <w:rFonts w:ascii="Times New Roman" w:hAnsi="Times New Roman"/>
         </w:rPr>
-        <w:t xml:space="preserve">Chuang Gang, Ming Lin, Yi Yang, Alexander G. Hauptmann. Exploring Semantic Inter-Class Relationships (SIR) for Zero-Shot Action </w:t>
-      </w:r>
-      <w:proofErr w:type="spellStart"/>
-      <w:r>
-        <w:rPr>
-          <w:rFonts w:ascii="Times New Roman" w:hAnsi="Times New Roman"/>
-        </w:rPr>
-        <w:t>Recognition.In</w:t>
-      </w:r>
-      <w:proofErr w:type="spellEnd"/>
-      <w:r>
-        <w:rPr>
-          <w:rFonts w:ascii="Times New Roman" w:hAnsi="Times New Roman"/>
-        </w:rPr>
-        <w:t xml:space="preserve"> Proceedings of the </w:t>
-      </w:r>
-      <w:proofErr w:type="spellStart"/>
-      <w:r>
-        <w:rPr>
-          <w:rFonts w:ascii="Times New Roman" w:hAnsi="Times New Roman"/>
-        </w:rPr>
-        <w:t>the</w:t>
-      </w:r>
-      <w:proofErr w:type="spellEnd"/>
-      <w:r>
-        <w:rPr>
-          <w:rFonts w:ascii="Times New Roman" w:hAnsi="Times New Roman"/>
-        </w:rPr>
-        <w:t xml:space="preserve"> 29th </w:t>
-      </w:r>
-      <w:proofErr w:type="spellStart"/>
-      <w:r>
-        <w:rPr>
-          <w:rFonts w:ascii="Times New Roman" w:hAnsi="Times New Roman"/>
-        </w:rPr>
-        <w:t>AAAIConference</w:t>
-      </w:r>
-      <w:proofErr w:type="spellEnd"/>
-      <w:r>
-        <w:rPr>
-          <w:rFonts w:ascii="Times New Roman" w:hAnsi="Times New Roman"/>
-        </w:rPr>
-        <w:t xml:space="preserve"> on Artificial Intelligence (AAAI), 2015.</w:t>
+        <w:t>Chuang Gang, Ming Lin, Yi Yang, Alexander G. Hauptmann. Exploring Semantic Inter-Class Relationships (SIR) for Zero-Shot Action Recognition.In Proceedings of the the 29th AAAIConference on Artificial Intelligence (AAAI), 2015.</w:t>
       </w:r>
     </w:p>
     <w:p>
@@ -1496,29 +1252,59 @@
           <w:numId w:val="4"/>
         </w:numPr>
         <w:rPr>
-          <w:rFonts w:ascii="Times New Roman" w:hAnsi="Times New Roman"/>
-        </w:rPr>
-      </w:pPr>
-      <w:r>
-        <w:rPr>
-          <w:rFonts w:ascii="Times New Roman" w:hAnsi="Times New Roman"/>
-        </w:rPr>
-        <w:t xml:space="preserve">Chuang Gang, Ming Lin, Yi Yang, Gerard de </w:t>
-      </w:r>
-      <w:proofErr w:type="spellStart"/>
-      <w:r>
-        <w:rPr>
-          <w:rFonts w:ascii="Times New Roman" w:hAnsi="Times New Roman"/>
-        </w:rPr>
-        <w:t>Melo</w:t>
-      </w:r>
-      <w:proofErr w:type="spellEnd"/>
-      <w:r>
-        <w:rPr>
-          <w:rFonts w:ascii="Times New Roman" w:hAnsi="Times New Roman"/>
-        </w:rPr>
-        <w:t>, Alexander G. Hauptmann. Concepts Not Alone: Exploring Pairwise Relationships for Zero-Shot Video Activity Recognition.  The Thirtieth AAAI Conference on Artificial Intelligence (AAAI), 2016.</w:t>
-      </w:r>
+          <w:rFonts w:ascii="Times New Roman" w:hAnsi="Times New Roman" w:hint="eastAsia"/>
+        </w:rPr>
+      </w:pPr>
+      <w:r>
+        <w:rPr>
+          <w:rFonts w:ascii="Times New Roman" w:hAnsi="Times New Roman"/>
+        </w:rPr>
+        <w:t>Chuang Gang, Ming Lin, Yi Yang, Gerard de Melo, Alexander G. Hauptmann. Concepts Not Alone: Exploring Pairwise Relationships for Zero-Shot Video Activity Recognition.  The Thirtieth AAAI Conference on Artificial Intelligence (AAAI), 2016.</w:t>
+      </w:r>
+    </w:p>
+    <w:p>
+      <w:pPr>
+        <w:pStyle w:val="a8"/>
+        <w:numPr>
+          <w:ilvl w:val="0"/>
+          <w:numId w:val="4"/>
+        </w:numPr>
+        <w:rPr>
+          <w:rFonts w:ascii="Times New Roman" w:hAnsi="Times New Roman"/>
+        </w:rPr>
+      </w:pPr>
+      <w:r>
+        <w:rPr>
+          <w:rFonts w:ascii="Times New Roman" w:hAnsi="Times New Roman" w:hint="eastAsia"/>
+        </w:rPr>
+        <w:t xml:space="preserve">Ming Lin, Jieping Ye. </w:t>
+      </w:r>
+      <w:r>
+        <w:rPr>
+          <w:rFonts w:ascii="Times New Roman" w:hAnsi="Times New Roman"/>
+        </w:rPr>
+        <w:t>A Non-convex One-Pass Framework for Generalized Factorization Machine and Rank-One Matrix Sensing</w:t>
+      </w:r>
+      <w:r>
+        <w:rPr>
+          <w:rFonts w:ascii="Times New Roman" w:hAnsi="Times New Roman" w:hint="eastAsia"/>
+        </w:rPr>
+        <w:t xml:space="preserve">. </w:t>
+      </w:r>
+      <w:r>
+        <w:rPr>
+          <w:rFonts w:ascii="Times New Roman" w:hAnsi="Times New Roman"/>
+        </w:rPr>
+        <w:t>The Thirtieth Annual Conference on Neural Information Processing Systems (NIPS)</w:t>
+      </w:r>
+      <w:r>
+        <w:rPr>
+          <w:rFonts w:ascii="Times New Roman" w:hAnsi="Times New Roman" w:hint="eastAsia"/>
+        </w:rPr>
+        <w:t>, 2016.</w:t>
+      </w:r>
+      <w:bookmarkStart w:id="0" w:name="_GoBack"/>
+      <w:bookmarkEnd w:id="0"/>
     </w:p>
     <w:p>
       <w:pPr>
@@ -1560,61 +1346,11 @@
           <w:rFonts w:ascii="Times New Roman" w:hAnsi="Times New Roman"/>
         </w:rPr>
       </w:pPr>
-      <w:proofErr w:type="spellStart"/>
-      <w:r>
-        <w:rPr>
-          <w:rFonts w:ascii="Times New Roman" w:hAnsi="Times New Roman"/>
-        </w:rPr>
-        <w:t>Shizhun</w:t>
-      </w:r>
-      <w:proofErr w:type="spellEnd"/>
-      <w:r>
-        <w:rPr>
-          <w:rFonts w:ascii="Times New Roman" w:hAnsi="Times New Roman"/>
-        </w:rPr>
-        <w:t xml:space="preserve"> Yang, Ming Lin, </w:t>
-      </w:r>
-      <w:proofErr w:type="spellStart"/>
-      <w:r>
-        <w:rPr>
-          <w:rFonts w:ascii="Times New Roman" w:hAnsi="Times New Roman"/>
-        </w:rPr>
-        <w:t>Chenping</w:t>
-      </w:r>
-      <w:proofErr w:type="spellEnd"/>
-      <w:r>
-        <w:rPr>
-          <w:rFonts w:ascii="Times New Roman" w:hAnsi="Times New Roman"/>
-        </w:rPr>
-        <w:t xml:space="preserve"> </w:t>
-      </w:r>
-      <w:proofErr w:type="spellStart"/>
-      <w:r>
-        <w:rPr>
-          <w:rFonts w:ascii="Times New Roman" w:hAnsi="Times New Roman"/>
-        </w:rPr>
-        <w:t>Hou</w:t>
-      </w:r>
-      <w:proofErr w:type="spellEnd"/>
-      <w:r>
-        <w:rPr>
-          <w:rFonts w:ascii="Times New Roman" w:hAnsi="Times New Roman"/>
-        </w:rPr>
-        <w:t xml:space="preserve">, </w:t>
-      </w:r>
-      <w:proofErr w:type="spellStart"/>
-      <w:r>
-        <w:rPr>
-          <w:rFonts w:ascii="Times New Roman" w:hAnsi="Times New Roman"/>
-        </w:rPr>
-        <w:t>Changshui</w:t>
-      </w:r>
-      <w:proofErr w:type="spellEnd"/>
-      <w:r>
-        <w:rPr>
-          <w:rFonts w:ascii="Times New Roman" w:hAnsi="Times New Roman"/>
-        </w:rPr>
-        <w:t xml:space="preserve"> Zhang, Yi Wu. A General Framework for Transfer Sparse Subspace Learning. Neural Computing and Applications. Volume 21, Number 7, Pages 1801-1817, August 2012.</w:t>
+      <w:r>
+        <w:rPr>
+          <w:rFonts w:ascii="Times New Roman" w:hAnsi="Times New Roman"/>
+        </w:rPr>
+        <w:t>Shizhun Yang, Ming Lin, Chenping Hou, Changshui Zhang, Yi Wu. A General Framework for Transfer Sparse Subspace Learning. Neural Computing and Applications. Volume 21, Number 7, Pages 1801-1817, August 2012.</w:t>
       </w:r>
     </w:p>
     <w:p>
@@ -1632,49 +1368,7 @@
         <w:rPr>
           <w:rFonts w:ascii="Times New Roman" w:hAnsi="Times New Roman"/>
         </w:rPr>
-        <w:t xml:space="preserve">Ming Lin, </w:t>
-      </w:r>
-      <w:proofErr w:type="spellStart"/>
-      <w:r>
-        <w:rPr>
-          <w:rFonts w:ascii="Times New Roman" w:hAnsi="Times New Roman"/>
-        </w:rPr>
-        <w:t>Shifeng</w:t>
-      </w:r>
-      <w:proofErr w:type="spellEnd"/>
-      <w:r>
-        <w:rPr>
-          <w:rFonts w:ascii="Times New Roman" w:hAnsi="Times New Roman"/>
-        </w:rPr>
-        <w:t xml:space="preserve"> </w:t>
-      </w:r>
-      <w:proofErr w:type="spellStart"/>
-      <w:r>
-        <w:rPr>
-          <w:rFonts w:ascii="Times New Roman" w:hAnsi="Times New Roman"/>
-        </w:rPr>
-        <w:t>Weng</w:t>
-      </w:r>
-      <w:proofErr w:type="spellEnd"/>
-      <w:r>
-        <w:rPr>
-          <w:rFonts w:ascii="Times New Roman" w:hAnsi="Times New Roman"/>
-        </w:rPr>
-        <w:t xml:space="preserve">, </w:t>
-      </w:r>
-      <w:proofErr w:type="spellStart"/>
-      <w:r>
-        <w:rPr>
-          <w:rFonts w:ascii="Times New Roman" w:hAnsi="Times New Roman"/>
-        </w:rPr>
-        <w:t>Changshui</w:t>
-      </w:r>
-      <w:proofErr w:type="spellEnd"/>
-      <w:r>
-        <w:rPr>
-          <w:rFonts w:ascii="Times New Roman" w:hAnsi="Times New Roman"/>
-        </w:rPr>
-        <w:t xml:space="preserve"> Zhang. On the Sample Complexity of Random Fourier Features for Online Learning. ACM Transactions on Knowledge Discovery from Data (TKDD), Volume 8 Issue 3, Pages 13:1--13:19, June 2014.</w:t>
+        <w:t>Ming Lin, Shifeng Weng, Changshui Zhang. On the Sample Complexity of Random Fourier Features for Online Learning. ACM Transactions on Knowledge Discovery from Data (TKDD), Volume 8 Issue 3, Pages 13:1--13:19, June 2014.</w:t>
       </w:r>
     </w:p>
     <w:p>
@@ -1692,49 +1386,7 @@
         <w:rPr>
           <w:rFonts w:ascii="Times New Roman" w:hAnsi="Times New Roman"/>
         </w:rPr>
-        <w:t xml:space="preserve">Ming Lin, </w:t>
-      </w:r>
-      <w:proofErr w:type="spellStart"/>
-      <w:r>
-        <w:rPr>
-          <w:rFonts w:ascii="Times New Roman" w:hAnsi="Times New Roman"/>
-        </w:rPr>
-        <w:t>Fei</w:t>
-      </w:r>
-      <w:proofErr w:type="spellEnd"/>
-      <w:r>
-        <w:rPr>
-          <w:rFonts w:ascii="Times New Roman" w:hAnsi="Times New Roman"/>
-        </w:rPr>
-        <w:t xml:space="preserve"> Wang, </w:t>
-      </w:r>
-      <w:proofErr w:type="spellStart"/>
-      <w:r>
-        <w:rPr>
-          <w:rFonts w:ascii="Times New Roman" w:hAnsi="Times New Roman"/>
-        </w:rPr>
-        <w:t>Changshui</w:t>
-      </w:r>
-      <w:proofErr w:type="spellEnd"/>
-      <w:r>
-        <w:rPr>
-          <w:rFonts w:ascii="Times New Roman" w:hAnsi="Times New Roman"/>
-        </w:rPr>
-        <w:t xml:space="preserve"> Zhang.  Large-Scale Eigenvector Approximation via Hilbert Space Embedding Nystrom.  Pattern Recognition (PR), 48(5), </w:t>
-      </w:r>
-      <w:proofErr w:type="spellStart"/>
-      <w:r>
-        <w:rPr>
-          <w:rFonts w:ascii="Times New Roman" w:hAnsi="Times New Roman"/>
-        </w:rPr>
-        <w:t>pp</w:t>
-      </w:r>
-      <w:proofErr w:type="spellEnd"/>
-      <w:r>
-        <w:rPr>
-          <w:rFonts w:ascii="Times New Roman" w:hAnsi="Times New Roman"/>
-        </w:rPr>
-        <w:t xml:space="preserve"> 1904-1912, 2015. </w:t>
+        <w:t xml:space="preserve">Ming Lin, Fei Wang, Changshui Zhang.  Large-Scale Eigenvector Approximation via Hilbert Space Embedding Nystrom.  Pattern Recognition (PR), 48(5), pp 1904-1912, 2015. </w:t>
       </w:r>
     </w:p>
     <w:p>
@@ -1748,89 +1400,11 @@
           <w:rFonts w:ascii="Times New Roman" w:hAnsi="Times New Roman"/>
         </w:rPr>
       </w:pPr>
-      <w:proofErr w:type="spellStart"/>
-      <w:r>
-        <w:rPr>
-          <w:rFonts w:ascii="Times New Roman" w:hAnsi="Times New Roman"/>
-        </w:rPr>
-        <w:t>Zheng</w:t>
-      </w:r>
-      <w:proofErr w:type="spellEnd"/>
-      <w:r>
-        <w:rPr>
-          <w:rFonts w:ascii="Times New Roman" w:hAnsi="Times New Roman"/>
-        </w:rPr>
-        <w:t xml:space="preserve"> Pan, Ming Lin, Guangdong </w:t>
-      </w:r>
-      <w:proofErr w:type="spellStart"/>
-      <w:r>
-        <w:rPr>
-          <w:rFonts w:ascii="Times New Roman" w:hAnsi="Times New Roman"/>
-        </w:rPr>
-        <w:t>Hou</w:t>
-      </w:r>
-      <w:proofErr w:type="spellEnd"/>
-      <w:r>
-        <w:rPr>
-          <w:rFonts w:ascii="Times New Roman" w:hAnsi="Times New Roman"/>
-        </w:rPr>
-        <w:t xml:space="preserve">, </w:t>
-      </w:r>
-      <w:proofErr w:type="spellStart"/>
-      <w:r>
-        <w:rPr>
-          <w:rFonts w:ascii="Times New Roman" w:hAnsi="Times New Roman"/>
-        </w:rPr>
-        <w:t>Changshui</w:t>
-      </w:r>
-      <w:proofErr w:type="spellEnd"/>
-      <w:r>
-        <w:rPr>
-          <w:rFonts w:ascii="Times New Roman" w:hAnsi="Times New Roman"/>
-        </w:rPr>
-        <w:t xml:space="preserve"> Zhang. Damping proximal coordinate descent algorithm for non-convex regularization. </w:t>
-      </w:r>
-      <w:proofErr w:type="spellStart"/>
-      <w:r>
-        <w:rPr>
-          <w:rFonts w:ascii="Times New Roman" w:hAnsi="Times New Roman"/>
-        </w:rPr>
-        <w:t>Neurocomputing</w:t>
-      </w:r>
-      <w:proofErr w:type="spellEnd"/>
-      <w:r>
-        <w:rPr>
-          <w:rFonts w:ascii="Times New Roman" w:hAnsi="Times New Roman"/>
-        </w:rPr>
-        <w:t xml:space="preserve">, </w:t>
-      </w:r>
-      <w:proofErr w:type="spellStart"/>
-      <w:r>
-        <w:rPr>
-          <w:rFonts w:ascii="Times New Roman" w:hAnsi="Times New Roman"/>
-        </w:rPr>
-        <w:t>vol</w:t>
-      </w:r>
-      <w:proofErr w:type="spellEnd"/>
-      <w:r>
-        <w:rPr>
-          <w:rFonts w:ascii="Times New Roman" w:hAnsi="Times New Roman"/>
-        </w:rPr>
-        <w:t xml:space="preserve"> 152 </w:t>
-      </w:r>
-      <w:proofErr w:type="spellStart"/>
-      <w:r>
-        <w:rPr>
-          <w:rFonts w:ascii="Times New Roman" w:hAnsi="Times New Roman"/>
-        </w:rPr>
-        <w:t>pp</w:t>
-      </w:r>
-      <w:proofErr w:type="spellEnd"/>
-      <w:r>
-        <w:rPr>
-          <w:rFonts w:ascii="Times New Roman" w:hAnsi="Times New Roman"/>
-        </w:rPr>
-        <w:t xml:space="preserve"> 151-163, 2015. </w:t>
+      <w:r>
+        <w:rPr>
+          <w:rFonts w:ascii="Times New Roman" w:hAnsi="Times New Roman"/>
+        </w:rPr>
+        <w:t xml:space="preserve">Zheng Pan, Ming Lin, Guangdong Hou, Changshui Zhang. Damping proximal coordinate descent algorithm for non-convex regularization. Neurocomputing, vol 152 pp 151-163, 2015. </w:t>
       </w:r>
     </w:p>
     <w:p>
@@ -1848,6 +1422,7 @@
         <w:rPr>
           <w:rFonts w:ascii="Times New Roman" w:hAnsi="Times New Roman"/>
         </w:rPr>
+        <w:lastRenderedPageBreak/>
         <w:t>Zhen Hu, Ming Lin, Changshui Zhang. Dependent Online Kernel Learning with Constant Number of Random Fourier Features. IEEE Transactions on Neural Networks and Learning Systems (TNNLS), 2015.</w:t>
       </w:r>
     </w:p>
@@ -1866,95 +1441,8 @@
         <w:rPr>
           <w:rFonts w:ascii="Times New Roman" w:hAnsi="Times New Roman"/>
         </w:rPr>
-        <w:lastRenderedPageBreak/>
-        <w:t xml:space="preserve">Ming Lin, </w:t>
-      </w:r>
-      <w:proofErr w:type="spellStart"/>
-      <w:r>
-        <w:rPr>
-          <w:rFonts w:ascii="Times New Roman" w:hAnsi="Times New Roman"/>
-        </w:rPr>
-        <w:t>Lijun</w:t>
-      </w:r>
-      <w:proofErr w:type="spellEnd"/>
-      <w:r>
-        <w:rPr>
-          <w:rFonts w:ascii="Times New Roman" w:hAnsi="Times New Roman"/>
-        </w:rPr>
-        <w:t xml:space="preserve"> Zhang, </w:t>
-      </w:r>
-      <w:proofErr w:type="spellStart"/>
-      <w:r>
-        <w:rPr>
-          <w:rFonts w:ascii="Times New Roman" w:hAnsi="Times New Roman"/>
-        </w:rPr>
-        <w:t>Rong</w:t>
-      </w:r>
-      <w:proofErr w:type="spellEnd"/>
-      <w:r>
-        <w:rPr>
-          <w:rFonts w:ascii="Times New Roman" w:hAnsi="Times New Roman"/>
-        </w:rPr>
-        <w:t xml:space="preserve"> Jin, </w:t>
-      </w:r>
-      <w:proofErr w:type="spellStart"/>
-      <w:r>
-        <w:rPr>
-          <w:rFonts w:ascii="Times New Roman" w:hAnsi="Times New Roman"/>
-        </w:rPr>
-        <w:t>Shifeng</w:t>
-      </w:r>
-      <w:proofErr w:type="spellEnd"/>
-      <w:r>
-        <w:rPr>
-          <w:rFonts w:ascii="Times New Roman" w:hAnsi="Times New Roman"/>
-        </w:rPr>
-        <w:t xml:space="preserve"> </w:t>
-      </w:r>
-      <w:proofErr w:type="spellStart"/>
-      <w:r>
-        <w:rPr>
-          <w:rFonts w:ascii="Times New Roman" w:hAnsi="Times New Roman"/>
-        </w:rPr>
-        <w:t>Weng</w:t>
-      </w:r>
-      <w:proofErr w:type="spellEnd"/>
-      <w:r>
-        <w:rPr>
-          <w:rFonts w:ascii="Times New Roman" w:hAnsi="Times New Roman"/>
-        </w:rPr>
-        <w:t xml:space="preserve">, </w:t>
-      </w:r>
-      <w:proofErr w:type="spellStart"/>
-      <w:r>
-        <w:rPr>
-          <w:rFonts w:ascii="Times New Roman" w:hAnsi="Times New Roman"/>
-        </w:rPr>
-        <w:t>Changshui</w:t>
-      </w:r>
-      <w:proofErr w:type="spellEnd"/>
-      <w:r>
-        <w:rPr>
-          <w:rFonts w:ascii="Times New Roman" w:hAnsi="Times New Roman"/>
-        </w:rPr>
-        <w:t xml:space="preserve"> Zhang.  Online Kernel Learning with Nearly Constant Support Vectors. </w:t>
-      </w:r>
-      <w:proofErr w:type="spellStart"/>
-      <w:r>
-        <w:rPr>
-          <w:rFonts w:ascii="Times New Roman" w:hAnsi="Times New Roman"/>
-        </w:rPr>
-        <w:t>Neurocomputing</w:t>
-      </w:r>
-      <w:proofErr w:type="spellEnd"/>
-      <w:r>
-        <w:rPr>
-          <w:rFonts w:ascii="Times New Roman" w:hAnsi="Times New Roman"/>
-        </w:rPr>
-        <w:t>. Volume 179, Pages 26-36, 2016.</w:t>
-      </w:r>
-      <w:bookmarkStart w:id="0" w:name="_GoBack"/>
-      <w:bookmarkEnd w:id="0"/>
+        <w:t>Ming Lin, Lijun Zhang, Rong Jin, Shifeng Weng, Changshui Zhang.  Online Kernel Learning with Nearly Constant Support Vectors. Neurocomputing. Volume 179, Pages 26-36, 2016.</w:t>
+      </w:r>
     </w:p>
     <w:sectPr>
       <w:pgSz w:w="12240" w:h="15840"/>
@@ -4592,7 +4080,7 @@
 </file>
 
 <file path=customXml/itemProps1.xml><?xml version="1.0" encoding="utf-8"?>
-<ds:datastoreItem xmlns:ds="http://schemas.openxmlformats.org/officeDocument/2006/customXml" ds:itemID="{51418D5A-DAA1-4C06-8A3F-5591336CF66E}">
+<ds:datastoreItem xmlns:ds="http://schemas.openxmlformats.org/officeDocument/2006/customXml" ds:itemID="{67E70DAE-FD00-413A-B688-BF455BA56AAC}">
   <ds:schemaRefs>
     <ds:schemaRef ds:uri="http://schemas.openxmlformats.org/officeDocument/2006/bibliography"/>
   </ds:schemaRefs>

</xml_diff>